<commit_message>
fix(docs): correct diary page headers
</commit_message>
<xml_diff>
--- a/deliverables/RKNP/RKNP_зерттеу_күнделігі_дневник.docx
+++ b/deliverables/RKNP/RKNP_зерттеу_күнделігі_дневник.docx
@@ -216,9 +216,6 @@
         <w:gridCol w:w="9608"/>
       </w:tblGrid>
       <w:tr>
-        <w:trPr>
-          <w:tblHeader w:val="true"/>
-        </w:trPr>
         <w:tc>
           <w:tcPr>
             <w:tcW w:w="10248" w:type="dxa"/>
@@ -742,7 +739,6 @@
       <w:tr>
         <w:trPr>
           <w:trHeight w:val="300"/>
-          <w:tblHeader w:val="true"/>
         </w:trPr>
         <w:tc>
           <w:tcPr>
@@ -2908,9 +2904,6 @@
         <w:gridCol w:w="9607"/>
       </w:tblGrid>
       <w:tr>
-        <w:trPr>
-          <w:tblHeader w:val="true"/>
-        </w:trPr>
         <w:tc>
           <w:tcPr>
             <w:tcW w:w="10248" w:type="dxa"/>
@@ -3553,7 +3546,6 @@
       <w:tr>
         <w:trPr>
           <w:trHeight w:val="300"/>
-          <w:tblHeader w:val="true"/>
         </w:trPr>
         <w:tc>
           <w:tcPr>

</xml_diff>